<commit_message>
fix(word): aggiungi conteggi C e NA in tabella riepilogo
Made-with: Cursor
</commit_message>
<xml_diff>
--- a/app/public/templates/ISO45001-audit-report.docx
+++ b/app/public/templates/ISO45001-audit-report.docx
@@ -1434,6 +1434,142 @@
                 <w:szCs w:val="28"/>
               </w:rPr>
               <w:t>omCount</w:t>
+            </w:r>
+            <w:proofErr w:type="spellEnd"/>
+            <w:r>
+              <w:rPr>
+                <w:b/>
+                <w:bCs/>
+                <w:sz w:val="28"/>
+                <w:szCs w:val="28"/>
+              </w:rPr>
+              <w:t>}</w:t>
+            </w:r>
+          </w:p>
+        </w:tc>
+      </w:tr>
+      <w:tr>
+        <w:tblPrEx>
+          <w:tblCellMar>
+            <w:top w:w="0" w:type="dxa"/>
+            <w:bottom w:w="0" w:type="dxa"/>
+          </w:tblCellMar>
+        </w:tblPrEx>
+        <w:tc>
+          <w:tcPr>
+            <w:tcW w:w="0" w:type="auto"/>
+            <w:tcMar>
+              <w:top w:w="80" w:type="dxa"/>
+              <w:left w:w="100" w:type="dxa"/>
+              <w:bottom w:w="80" w:type="dxa"/>
+              <w:right w:w="100" w:type="dxa"/>
+            </w:tcMar>
+          </w:tcPr>
+          <w:p>
+            <w:r>
+              <w:rPr>
+                <w:b/>
+                <w:bCs/>
+              </w:rPr>
+              <w:t>Conforme (C)</w:t>
+            </w:r>
+          </w:p>
+        </w:tc>
+        <w:tc>
+          <w:tcPr>
+            <w:tcW w:w="750" w:type="pct"/>
+            <w:vAlign w:val="center"/>
+          </w:tcPr>
+          <w:p>
+            <w:pPr>
+              <w:jc w:val="center"/>
+            </w:pPr>
+            <w:r>
+              <w:rPr>
+                <w:b/>
+                <w:bCs/>
+                <w:sz w:val="28"/>
+                <w:szCs w:val="28"/>
+              </w:rPr>
+              <w:t>{</w:t>
+            </w:r>
+            <w:proofErr w:type="spellStart"/>
+            <w:r>
+              <w:rPr>
+                <w:b/>
+                <w:bCs/>
+                <w:sz w:val="28"/>
+                <w:szCs w:val="28"/>
+              </w:rPr>
+              <w:t>cCount</w:t>
+            </w:r>
+            <w:proofErr w:type="spellEnd"/>
+            <w:r>
+              <w:rPr>
+                <w:b/>
+                <w:bCs/>
+                <w:sz w:val="28"/>
+                <w:szCs w:val="28"/>
+              </w:rPr>
+              <w:t>}</w:t>
+            </w:r>
+          </w:p>
+        </w:tc>
+      </w:tr>
+      <w:tr>
+        <w:tblPrEx>
+          <w:tblCellMar>
+            <w:top w:w="0" w:type="dxa"/>
+            <w:bottom w:w="0" w:type="dxa"/>
+          </w:tblCellMar>
+        </w:tblPrEx>
+        <w:tc>
+          <w:tcPr>
+            <w:tcW w:w="0" w:type="auto"/>
+            <w:tcMar>
+              <w:top w:w="80" w:type="dxa"/>
+              <w:left w:w="100" w:type="dxa"/>
+              <w:bottom w:w="80" w:type="dxa"/>
+              <w:right w:w="100" w:type="dxa"/>
+            </w:tcMar>
+          </w:tcPr>
+          <w:p>
+            <w:r>
+              <w:rPr>
+                <w:b/>
+                <w:bCs/>
+              </w:rPr>
+              <w:t>Non Applicabile (N.A.)</w:t>
+            </w:r>
+          </w:p>
+        </w:tc>
+        <w:tc>
+          <w:tcPr>
+            <w:tcW w:w="750" w:type="pct"/>
+            <w:vAlign w:val="center"/>
+          </w:tcPr>
+          <w:p>
+            <w:pPr>
+              <w:jc w:val="center"/>
+            </w:pPr>
+            <w:r>
+              <w:rPr>
+                <w:b/>
+                <w:bCs/>
+                <w:sz w:val="28"/>
+                <w:szCs w:val="28"/>
+              </w:rPr>
+              <w:t>{</w:t>
+            </w:r>
+            <w:proofErr w:type="spellStart"/>
+            <w:r>
+              <w:rPr>
+                <w:b/>
+                <w:bCs/>
+                <w:sz w:val="28"/>
+                <w:szCs w:val="28"/>
+              </w:rPr>
+              <w:t>naCount</w:t>
             </w:r>
             <w:proofErr w:type="spellEnd"/>
             <w:r>

</xml_diff>